<commit_message>
Update ProGrade SKU registry UX and B-Wise stack height workflow
</commit_message>
<xml_diff>
--- a/docs/PG Load Building Tool Transition Guide (05.21.26).docx
+++ b/docs/PG Load Building Tool Transition Guide (05.21.26).docx
@@ -42,12 +42,6 @@
         <w:gridCol w:w="5180"/>
       </w:tblGrid>
       <w:tr>
-        <w:tblPrEx>
-          <w:tblCellMar>
-            <w:top w:w="0" w:type="dxa"/>
-            <w:bottom w:w="0" w:type="dxa"/>
-          </w:tblCellMar>
-        </w:tblPrEx>
         <w:tc>
           <w:tcPr>
             <w:tcW w:w="4900" w:type="dxa"/>
@@ -88,23 +82,7 @@
                 <w:sz w:val="18"/>
                 <w:szCs w:val="18"/>
               </w:rPr>
-              <w:t xml:space="preserve">The </w:t>
-            </w:r>
-            <w:proofErr w:type="spellStart"/>
-            <w:r>
-              <w:rPr>
-                <w:sz w:val="18"/>
-                <w:szCs w:val="18"/>
-              </w:rPr>
-              <w:t>ProGrade</w:t>
-            </w:r>
-            <w:proofErr w:type="spellEnd"/>
-            <w:r>
-              <w:rPr>
-                <w:sz w:val="18"/>
-                <w:szCs w:val="18"/>
-              </w:rPr>
-              <w:t xml:space="preserve"> Load Building Tool converts brand-specific stacking knowledge into a repeatable, team-independent workflow — enabling fulfillment and sales teams to design, validate, and refine trailer loads without relying on shipping experts for every fit decision.</w:t>
+              <w:t>The ProGrade Load Building Tool converts brand-specific stacking knowledge into a repeatable, team-independent workflow — enabling fulfillment and sales teams to design, validate, and refine trailer loads without relying on shipping experts for every fit decision.</w:t>
             </w:r>
           </w:p>
           <w:p>
@@ -292,12 +270,6 @@
         <w:gridCol w:w="6880"/>
       </w:tblGrid>
       <w:tr>
-        <w:tblPrEx>
-          <w:tblCellMar>
-            <w:top w:w="0" w:type="dxa"/>
-            <w:bottom w:w="0" w:type="dxa"/>
-          </w:tblCellMar>
-        </w:tblPrEx>
         <w:trPr>
           <w:tblHeader/>
         </w:trPr>
@@ -393,12 +365,6 @@
         </w:tc>
       </w:tr>
       <w:tr>
-        <w:tblPrEx>
-          <w:tblCellMar>
-            <w:top w:w="0" w:type="dxa"/>
-            <w:bottom w:w="0" w:type="dxa"/>
-          </w:tblCellMar>
-        </w:tblPrEx>
         <w:tc>
           <w:tcPr>
             <w:tcW w:w="1000" w:type="dxa"/>
@@ -482,12 +448,6 @@
         </w:tc>
       </w:tr>
       <w:tr>
-        <w:tblPrEx>
-          <w:tblCellMar>
-            <w:top w:w="0" w:type="dxa"/>
-            <w:bottom w:w="0" w:type="dxa"/>
-          </w:tblCellMar>
-        </w:tblPrEx>
         <w:tc>
           <w:tcPr>
             <w:tcW w:w="1000" w:type="dxa"/>
@@ -571,12 +531,6 @@
         </w:tc>
       </w:tr>
       <w:tr>
-        <w:tblPrEx>
-          <w:tblCellMar>
-            <w:top w:w="0" w:type="dxa"/>
-            <w:bottom w:w="0" w:type="dxa"/>
-          </w:tblCellMar>
-        </w:tblPrEx>
         <w:tc>
           <w:tcPr>
             <w:tcW w:w="1000" w:type="dxa"/>
@@ -714,12 +668,6 @@
         <w:gridCol w:w="1696"/>
       </w:tblGrid>
       <w:tr>
-        <w:tblPrEx>
-          <w:tblCellMar>
-            <w:top w:w="0" w:type="dxa"/>
-            <w:bottom w:w="0" w:type="dxa"/>
-          </w:tblCellMar>
-        </w:tblPrEx>
         <w:tc>
           <w:tcPr>
             <w:tcW w:w="1696" w:type="dxa"/>
@@ -1201,12 +1149,6 @@
         <w:gridCol w:w="10080"/>
       </w:tblGrid>
       <w:tr>
-        <w:tblPrEx>
-          <w:tblCellMar>
-            <w:top w:w="0" w:type="dxa"/>
-            <w:bottom w:w="0" w:type="dxa"/>
-          </w:tblCellMar>
-        </w:tblPrEx>
         <w:tc>
           <w:tcPr>
             <w:tcW w:w="10080" w:type="dxa"/>
@@ -1255,23 +1197,7 @@
                 <w:sz w:val="19"/>
                 <w:szCs w:val="19"/>
               </w:rPr>
-              <w:t xml:space="preserve">Final shipping release still requires carrier judgment and regulatory review (state height limits, </w:t>
-            </w:r>
-            <w:proofErr w:type="gramStart"/>
-            <w:r>
-              <w:rPr>
-                <w:sz w:val="19"/>
-                <w:szCs w:val="19"/>
-              </w:rPr>
-              <w:t>overhang</w:t>
-            </w:r>
-            <w:proofErr w:type="gramEnd"/>
-            <w:r>
-              <w:rPr>
-                <w:sz w:val="19"/>
-                <w:szCs w:val="19"/>
-              </w:rPr>
-              <w:t>, route-specific constraints). Confirm truck profile early to avoid late-stage redesign. Maintain SKU dimensions and stack assumptions as controlled operational data.</w:t>
+              <w:t>Final shipping release still requires carrier judgment and regulatory review (state height limits, overhang, route-specific constraints). Confirm truck profile early to avoid late-stage redesign. Maintain SKU dimensions and stack assumptions as controlled operational data.</w:t>
             </w:r>
           </w:p>
         </w:tc>
@@ -1321,10 +1247,7 @@
         </w:numPr>
       </w:pPr>
       <w:r>
-        <w:t xml:space="preserve">Reduce single-person dependency in load design </w:t>
-      </w:r>
-      <w:r>
-        <w:t>decisions</w:t>
+        <w:t>Reduce single-person dependency in load design decisions</w:t>
       </w:r>
     </w:p>
     <w:p>
@@ -1384,10 +1307,7 @@
         </w:numPr>
       </w:pPr>
       <w:r>
-        <w:t>F</w:t>
-      </w:r>
-      <w:r>
-        <w:t>aster inventory movement by surfacing feasible fill candidates that are currently on hand</w:t>
+        <w:t>Faster inventory movement by surfacing feasible fill candidates that are currently on hand</w:t>
       </w:r>
     </w:p>
     <w:p>
@@ -1414,11 +1334,6 @@
       <w:r>
         <w:t>Use Cases by Brand</w:t>
       </w:r>
-    </w:p>
-    <w:p>
-      <w:pPr>
-        <w:pStyle w:val="Heading2"/>
-      </w:pPr>
     </w:p>
     <w:tbl>
       <w:tblPr>
@@ -1444,12 +1359,6 @@
         <w:gridCol w:w="4180"/>
       </w:tblGrid>
       <w:tr>
-        <w:tblPrEx>
-          <w:tblCellMar>
-            <w:top w:w="0" w:type="dxa"/>
-            <w:bottom w:w="0" w:type="dxa"/>
-          </w:tblCellMar>
-        </w:tblPrEx>
         <w:trPr>
           <w:tblHeader/>
         </w:trPr>
@@ -1479,8 +1388,28 @@
                 <w:sz w:val="19"/>
                 <w:szCs w:val="19"/>
               </w:rPr>
-              <w:t>B</w:t>
-            </w:r>
+              <w:t>Brand</w:t>
+            </w:r>
+          </w:p>
+        </w:tc>
+        <w:tc>
+          <w:tcPr>
+            <w:tcW w:w="2000" w:type="dxa"/>
+            <w:tcBorders>
+              <w:top w:val="single" w:sz="1" w:space="0" w:color="C9C9C9"/>
+              <w:left w:val="single" w:sz="1" w:space="0" w:color="C9C9C9"/>
+              <w:bottom w:val="single" w:sz="1" w:space="0" w:color="C9C9C9"/>
+              <w:right w:val="single" w:sz="1" w:space="0" w:color="C9C9C9"/>
+            </w:tcBorders>
+            <w:shd w:val="clear" w:color="auto" w:fill="1F3864"/>
+            <w:tcMar>
+              <w:top w:w="100" w:type="dxa"/>
+              <w:left w:w="140" w:type="dxa"/>
+              <w:bottom w:w="100" w:type="dxa"/>
+              <w:right w:w="120" w:type="dxa"/>
+            </w:tcMar>
+          </w:tcPr>
+          <w:p>
             <w:r>
               <w:rPr>
                 <w:b/>
@@ -1489,13 +1418,13 @@
                 <w:sz w:val="19"/>
                 <w:szCs w:val="19"/>
               </w:rPr>
-              <w:t>rand</w:t>
-            </w:r>
-          </w:p>
-        </w:tc>
-        <w:tc>
-          <w:tcPr>
-            <w:tcW w:w="2000" w:type="dxa"/>
+              <w:t>Typical User Group</w:t>
+            </w:r>
+          </w:p>
+        </w:tc>
+        <w:tc>
+          <w:tcPr>
+            <w:tcW w:w="3000" w:type="dxa"/>
             <w:tcBorders>
               <w:top w:val="single" w:sz="1" w:space="0" w:color="C9C9C9"/>
               <w:left w:val="single" w:sz="1" w:space="0" w:color="C9C9C9"/>
@@ -1519,13 +1448,13 @@
                 <w:sz w:val="19"/>
                 <w:szCs w:val="19"/>
               </w:rPr>
-              <w:t>Typical User Group</w:t>
-            </w:r>
-          </w:p>
-        </w:tc>
-        <w:tc>
-          <w:tcPr>
-            <w:tcW w:w="3000" w:type="dxa"/>
+              <w:t>Typical Trigger</w:t>
+            </w:r>
+          </w:p>
+        </w:tc>
+        <w:tc>
+          <w:tcPr>
+            <w:tcW w:w="4180" w:type="dxa"/>
             <w:tcBorders>
               <w:top w:val="single" w:sz="1" w:space="0" w:color="C9C9C9"/>
               <w:left w:val="single" w:sz="1" w:space="0" w:color="C9C9C9"/>
@@ -1549,51 +1478,42 @@
                 <w:sz w:val="19"/>
                 <w:szCs w:val="19"/>
               </w:rPr>
-              <w:t>Typical Trigger</w:t>
-            </w:r>
-          </w:p>
-        </w:tc>
-        <w:tc>
-          <w:tcPr>
-            <w:tcW w:w="4180" w:type="dxa"/>
+              <w:t>Business Benefit</w:t>
+            </w:r>
+          </w:p>
+        </w:tc>
+      </w:tr>
+      <w:tr>
+        <w:tc>
+          <w:tcPr>
+            <w:tcW w:w="900" w:type="dxa"/>
             <w:tcBorders>
               <w:top w:val="single" w:sz="1" w:space="0" w:color="C9C9C9"/>
               <w:left w:val="single" w:sz="1" w:space="0" w:color="C9C9C9"/>
               <w:bottom w:val="single" w:sz="1" w:space="0" w:color="C9C9C9"/>
               <w:right w:val="single" w:sz="1" w:space="0" w:color="C9C9C9"/>
             </w:tcBorders>
-            <w:shd w:val="clear" w:color="auto" w:fill="1F3864"/>
-            <w:tcMar>
-              <w:top w:w="100" w:type="dxa"/>
+            <w:shd w:val="clear" w:color="auto" w:fill="FFFFFF"/>
+            <w:tcMar>
+              <w:top w:w="80" w:type="dxa"/>
               <w:left w:w="140" w:type="dxa"/>
-              <w:bottom w:w="100" w:type="dxa"/>
+              <w:bottom w:w="80" w:type="dxa"/>
               <w:right w:w="120" w:type="dxa"/>
             </w:tcMar>
           </w:tcPr>
           <w:p>
             <w:r>
               <w:rPr>
-                <w:b/>
-                <w:bCs/>
-                <w:color w:val="FFFFFF"/>
-                <w:sz w:val="19"/>
-                <w:szCs w:val="19"/>
-              </w:rPr>
-              <w:t>Business Benefit</w:t>
-            </w:r>
-          </w:p>
-        </w:tc>
-      </w:tr>
-      <w:tr>
-        <w:tblPrEx>
-          <w:tblCellMar>
-            <w:top w:w="0" w:type="dxa"/>
-            <w:bottom w:w="0" w:type="dxa"/>
-          </w:tblCellMar>
-        </w:tblPrEx>
-        <w:tc>
-          <w:tcPr>
-            <w:tcW w:w="900" w:type="dxa"/>
+                <w:sz w:val="18"/>
+                <w:szCs w:val="18"/>
+              </w:rPr>
+              <w:t>PJ</w:t>
+            </w:r>
+          </w:p>
+        </w:tc>
+        <w:tc>
+          <w:tcPr>
+            <w:tcW w:w="2000" w:type="dxa"/>
             <w:tcBorders>
               <w:top w:val="single" w:sz="1" w:space="0" w:color="C9C9C9"/>
               <w:left w:val="single" w:sz="1" w:space="0" w:color="C9C9C9"/>
@@ -1614,13 +1534,13 @@
                 <w:sz w:val="18"/>
                 <w:szCs w:val="18"/>
               </w:rPr>
-              <w:t>PJ</w:t>
-            </w:r>
-          </w:p>
-        </w:tc>
-        <w:tc>
-          <w:tcPr>
-            <w:tcW w:w="2000" w:type="dxa"/>
+              <w:t>Sales representatives</w:t>
+            </w:r>
+          </w:p>
+        </w:tc>
+        <w:tc>
+          <w:tcPr>
+            <w:tcW w:w="3000" w:type="dxa"/>
             <w:tcBorders>
               <w:top w:val="single" w:sz="1" w:space="0" w:color="C9C9C9"/>
               <w:left w:val="single" w:sz="1" w:space="0" w:color="C9C9C9"/>
@@ -1641,13 +1561,13 @@
                 <w:sz w:val="18"/>
                 <w:szCs w:val="18"/>
               </w:rPr>
-              <w:t>Sales representatives</w:t>
-            </w:r>
-          </w:p>
-        </w:tc>
-        <w:tc>
-          <w:tcPr>
-            <w:tcW w:w="3000" w:type="dxa"/>
+              <w:t>Customer requests quote or load feasibility check</w:t>
+            </w:r>
+          </w:p>
+        </w:tc>
+        <w:tc>
+          <w:tcPr>
+            <w:tcW w:w="4180" w:type="dxa"/>
             <w:tcBorders>
               <w:top w:val="single" w:sz="1" w:space="0" w:color="C9C9C9"/>
               <w:left w:val="single" w:sz="1" w:space="0" w:color="C9C9C9"/>
@@ -1668,20 +1588,22 @@
                 <w:sz w:val="18"/>
                 <w:szCs w:val="18"/>
               </w:rPr>
-              <w:t>Customer requests quote or load feasibility check</w:t>
-            </w:r>
-          </w:p>
-        </w:tc>
-        <w:tc>
-          <w:tcPr>
-            <w:tcW w:w="4180" w:type="dxa"/>
+              <w:t>Faster customer response; improved freight absorption recommendations.</w:t>
+            </w:r>
+          </w:p>
+        </w:tc>
+      </w:tr>
+      <w:tr>
+        <w:tc>
+          <w:tcPr>
+            <w:tcW w:w="900" w:type="dxa"/>
             <w:tcBorders>
               <w:top w:val="single" w:sz="1" w:space="0" w:color="C9C9C9"/>
               <w:left w:val="single" w:sz="1" w:space="0" w:color="C9C9C9"/>
               <w:bottom w:val="single" w:sz="1" w:space="0" w:color="C9C9C9"/>
               <w:right w:val="single" w:sz="1" w:space="0" w:color="C9C9C9"/>
             </w:tcBorders>
-            <w:shd w:val="clear" w:color="auto" w:fill="FFFFFF"/>
+            <w:shd w:val="clear" w:color="auto" w:fill="F5F5F5"/>
             <w:tcMar>
               <w:top w:w="80" w:type="dxa"/>
               <w:left w:w="140" w:type="dxa"/>
@@ -1695,28 +1617,13 @@
                 <w:sz w:val="18"/>
                 <w:szCs w:val="18"/>
               </w:rPr>
-              <w:t>Faster customer response; improved freight absorption recommendations</w:t>
-            </w:r>
-            <w:r>
-              <w:rPr>
-                <w:sz w:val="18"/>
-                <w:szCs w:val="18"/>
-              </w:rPr>
-              <w:t>.</w:t>
-            </w:r>
-          </w:p>
-        </w:tc>
-      </w:tr>
-      <w:tr>
-        <w:tblPrEx>
-          <w:tblCellMar>
-            <w:top w:w="0" w:type="dxa"/>
-            <w:bottom w:w="0" w:type="dxa"/>
-          </w:tblCellMar>
-        </w:tblPrEx>
-        <w:tc>
-          <w:tcPr>
-            <w:tcW w:w="900" w:type="dxa"/>
+              <w:t>Big Tex</w:t>
+            </w:r>
+          </w:p>
+        </w:tc>
+        <w:tc>
+          <w:tcPr>
+            <w:tcW w:w="2000" w:type="dxa"/>
             <w:tcBorders>
               <w:top w:val="single" w:sz="1" w:space="0" w:color="C9C9C9"/>
               <w:left w:val="single" w:sz="1" w:space="0" w:color="C9C9C9"/>
@@ -1737,13 +1644,20 @@
                 <w:sz w:val="18"/>
                 <w:szCs w:val="18"/>
               </w:rPr>
-              <w:t>Big Tex</w:t>
-            </w:r>
-          </w:p>
-        </w:tc>
-        <w:tc>
-          <w:tcPr>
-            <w:tcW w:w="2000" w:type="dxa"/>
+              <w:t>Order fulfillment team</w:t>
+            </w:r>
+            <w:r>
+              <w:rPr>
+                <w:sz w:val="18"/>
+                <w:szCs w:val="18"/>
+              </w:rPr>
+              <w:t xml:space="preserve"> + Sales Team</w:t>
+            </w:r>
+          </w:p>
+        </w:tc>
+        <w:tc>
+          <w:tcPr>
+            <w:tcW w:w="3000" w:type="dxa"/>
             <w:tcBorders>
               <w:top w:val="single" w:sz="1" w:space="0" w:color="C9C9C9"/>
               <w:left w:val="single" w:sz="1" w:space="0" w:color="C9C9C9"/>
@@ -1759,18 +1673,88 @@
             </w:tcMar>
           </w:tcPr>
           <w:p>
-            <w:r>
+            <w:pPr>
               <w:rPr>
                 <w:sz w:val="18"/>
                 <w:szCs w:val="18"/>
               </w:rPr>
-              <w:t>Order fulfillment team</w:t>
-            </w:r>
-          </w:p>
-        </w:tc>
-        <w:tc>
-          <w:tcPr>
-            <w:tcW w:w="3000" w:type="dxa"/>
+            </w:pPr>
+            <w:r>
+              <w:rPr>
+                <w:sz w:val="18"/>
+                <w:szCs w:val="18"/>
+              </w:rPr>
+              <w:t xml:space="preserve">Non-standard or mixed </w:t>
+            </w:r>
+            <w:r>
+              <w:rPr>
+                <w:sz w:val="18"/>
+                <w:szCs w:val="18"/>
+              </w:rPr>
+              <w:t xml:space="preserve">category </w:t>
+            </w:r>
+            <w:r>
+              <w:rPr>
+                <w:sz w:val="18"/>
+                <w:szCs w:val="18"/>
+              </w:rPr>
+              <w:t>load request</w:t>
+            </w:r>
+            <w:r>
+              <w:rPr>
+                <w:sz w:val="18"/>
+                <w:szCs w:val="18"/>
+              </w:rPr>
+              <w:t xml:space="preserve"> </w:t>
+            </w:r>
+          </w:p>
+          <w:p>
+            <w:pPr>
+              <w:rPr>
+                <w:sz w:val="18"/>
+                <w:szCs w:val="18"/>
+              </w:rPr>
+            </w:pPr>
+          </w:p>
+          <w:p>
+            <w:pPr>
+              <w:rPr>
+                <w:i/>
+                <w:iCs/>
+              </w:rPr>
+            </w:pPr>
+            <w:r>
+              <w:rPr>
+                <w:i/>
+                <w:iCs/>
+                <w:sz w:val="18"/>
+                <w:szCs w:val="18"/>
+              </w:rPr>
+              <w:t>(40-50% of loads are non-traditional combinations</w:t>
+            </w:r>
+            <w:r>
+              <w:rPr>
+                <w:i/>
+                <w:iCs/>
+                <w:sz w:val="18"/>
+                <w:szCs w:val="18"/>
+              </w:rPr>
+              <w:t xml:space="preserve"> out of MP and Batavia</w:t>
+            </w:r>
+            <w:r>
+              <w:rPr>
+                <w:i/>
+                <w:iCs/>
+                <w:sz w:val="18"/>
+                <w:szCs w:val="18"/>
+              </w:rPr>
+              <w:t>)</w:t>
+            </w:r>
+          </w:p>
+        </w:tc>
+        <w:tc>
+          <w:tcPr>
+            <w:tcW w:w="4180" w:type="dxa"/>
             <w:tcBorders>
               <w:top w:val="single" w:sz="1" w:space="0" w:color="C9C9C9"/>
               <w:left w:val="single" w:sz="1" w:space="0" w:color="C9C9C9"/>
@@ -1786,39 +1770,81 @@
             </w:tcMar>
           </w:tcPr>
           <w:p>
-            <w:r>
+            <w:pPr>
               <w:rPr>
                 <w:sz w:val="18"/>
                 <w:szCs w:val="18"/>
               </w:rPr>
-              <w:t xml:space="preserve">Non-standard or mixed </w:t>
-            </w:r>
+            </w:pPr>
             <w:r>
               <w:rPr>
                 <w:sz w:val="18"/>
                 <w:szCs w:val="18"/>
               </w:rPr>
-              <w:t xml:space="preserve">category </w:t>
+              <w:t xml:space="preserve">Faster internal </w:t>
             </w:r>
             <w:r>
               <w:rPr>
                 <w:sz w:val="18"/>
                 <w:szCs w:val="18"/>
               </w:rPr>
-              <w:t>load request</w:t>
-            </w:r>
-          </w:p>
-        </w:tc>
-        <w:tc>
-          <w:tcPr>
-            <w:tcW w:w="4180" w:type="dxa"/>
+              <w:t>decision making around load configuration</w:t>
+            </w:r>
+            <w:r>
+              <w:rPr>
+                <w:sz w:val="18"/>
+                <w:szCs w:val="18"/>
+              </w:rPr>
+              <w:t xml:space="preserve"> without escalating each scenario to </w:t>
+            </w:r>
+            <w:r>
+              <w:rPr>
+                <w:sz w:val="18"/>
+                <w:szCs w:val="18"/>
+              </w:rPr>
+              <w:t>shipping manager (Jake M)</w:t>
+            </w:r>
+            <w:r>
+              <w:rPr>
+                <w:sz w:val="18"/>
+                <w:szCs w:val="18"/>
+              </w:rPr>
+              <w:t>.</w:t>
+            </w:r>
+          </w:p>
+          <w:p/>
+          <w:p>
+            <w:r>
+              <w:rPr>
+                <w:sz w:val="18"/>
+                <w:szCs w:val="18"/>
+              </w:rPr>
+              <w:t>Load optimization</w:t>
+            </w:r>
+            <w:r>
+              <w:rPr>
+                <w:sz w:val="18"/>
+                <w:szCs w:val="18"/>
+              </w:rPr>
+              <w:t>: higher load utilization if teams are armed with load fill visibility</w:t>
+            </w:r>
+            <w:r>
+              <w:t xml:space="preserve"> </w:t>
+            </w:r>
+          </w:p>
+        </w:tc>
+      </w:tr>
+      <w:tr>
+        <w:tc>
+          <w:tcPr>
+            <w:tcW w:w="900" w:type="dxa"/>
             <w:tcBorders>
               <w:top w:val="single" w:sz="1" w:space="0" w:color="C9C9C9"/>
               <w:left w:val="single" w:sz="1" w:space="0" w:color="C9C9C9"/>
               <w:bottom w:val="single" w:sz="1" w:space="0" w:color="C9C9C9"/>
               <w:right w:val="single" w:sz="1" w:space="0" w:color="C9C9C9"/>
             </w:tcBorders>
-            <w:shd w:val="clear" w:color="auto" w:fill="F5F5F5"/>
+            <w:shd w:val="clear" w:color="auto" w:fill="FFFFFF"/>
             <w:tcMar>
               <w:top w:w="80" w:type="dxa"/>
               <w:left w:w="140" w:type="dxa"/>
@@ -1832,35 +1858,13 @@
                 <w:sz w:val="18"/>
                 <w:szCs w:val="18"/>
               </w:rPr>
-              <w:t xml:space="preserve">Faster internal decisioning without escalating each scenario to </w:t>
-            </w:r>
-            <w:r>
-              <w:rPr>
-                <w:sz w:val="18"/>
-                <w:szCs w:val="18"/>
-              </w:rPr>
-              <w:t>shipping manager (Jake M)</w:t>
-            </w:r>
-            <w:r>
-              <w:rPr>
-                <w:sz w:val="18"/>
-                <w:szCs w:val="18"/>
-              </w:rPr>
-              <w:t>.</w:t>
-            </w:r>
-          </w:p>
-        </w:tc>
-      </w:tr>
-      <w:tr>
-        <w:tblPrEx>
-          <w:tblCellMar>
-            <w:top w:w="0" w:type="dxa"/>
-            <w:bottom w:w="0" w:type="dxa"/>
-          </w:tblCellMar>
-        </w:tblPrEx>
-        <w:tc>
-          <w:tcPr>
-            <w:tcW w:w="900" w:type="dxa"/>
+              <w:t>B-Wise</w:t>
+            </w:r>
+          </w:p>
+        </w:tc>
+        <w:tc>
+          <w:tcPr>
+            <w:tcW w:w="2000" w:type="dxa"/>
             <w:tcBorders>
               <w:top w:val="single" w:sz="1" w:space="0" w:color="C9C9C9"/>
               <w:left w:val="single" w:sz="1" w:space="0" w:color="C9C9C9"/>
@@ -1881,13 +1885,13 @@
                 <w:sz w:val="18"/>
                 <w:szCs w:val="18"/>
               </w:rPr>
-              <w:t>B-Wise</w:t>
-            </w:r>
-          </w:p>
-        </w:tc>
-        <w:tc>
-          <w:tcPr>
-            <w:tcW w:w="2000" w:type="dxa"/>
+              <w:t>TBD</w:t>
+            </w:r>
+          </w:p>
+        </w:tc>
+        <w:tc>
+          <w:tcPr>
+            <w:tcW w:w="3000" w:type="dxa"/>
             <w:tcBorders>
               <w:top w:val="single" w:sz="1" w:space="0" w:color="C9C9C9"/>
               <w:left w:val="single" w:sz="1" w:space="0" w:color="C9C9C9"/>
@@ -1904,17 +1908,13 @@
           </w:tcPr>
           <w:p>
             <w:r>
-              <w:rPr>
-                <w:sz w:val="18"/>
-                <w:szCs w:val="18"/>
-              </w:rPr>
               <w:t>TBD</w:t>
             </w:r>
           </w:p>
         </w:tc>
         <w:tc>
           <w:tcPr>
-            <w:tcW w:w="3000" w:type="dxa"/>
+            <w:tcW w:w="4180" w:type="dxa"/>
             <w:tcBorders>
               <w:top w:val="single" w:sz="1" w:space="0" w:color="C9C9C9"/>
               <w:left w:val="single" w:sz="1" w:space="0" w:color="C9C9C9"/>
@@ -1931,29 +1931,6 @@
           </w:tcPr>
           <w:p>
             <w:r>
-              <w:t>TBD</w:t>
-            </w:r>
-          </w:p>
-        </w:tc>
-        <w:tc>
-          <w:tcPr>
-            <w:tcW w:w="4180" w:type="dxa"/>
-            <w:tcBorders>
-              <w:top w:val="single" w:sz="1" w:space="0" w:color="C9C9C9"/>
-              <w:left w:val="single" w:sz="1" w:space="0" w:color="C9C9C9"/>
-              <w:bottom w:val="single" w:sz="1" w:space="0" w:color="C9C9C9"/>
-              <w:right w:val="single" w:sz="1" w:space="0" w:color="C9C9C9"/>
-            </w:tcBorders>
-            <w:shd w:val="clear" w:color="auto" w:fill="FFFFFF"/>
-            <w:tcMar>
-              <w:top w:w="80" w:type="dxa"/>
-              <w:left w:w="140" w:type="dxa"/>
-              <w:bottom w:w="80" w:type="dxa"/>
-              <w:right w:w="120" w:type="dxa"/>
-            </w:tcMar>
-          </w:tcPr>
-          <w:p>
-            <w:r>
               <w:rPr>
                 <w:sz w:val="18"/>
                 <w:szCs w:val="18"/>
@@ -2017,15 +1994,7 @@
         <w:ind w:left="180" w:right="180"/>
       </w:pPr>
       <w:r>
-        <w:t xml:space="preserve">Core Workflow </w:t>
-      </w:r>
-      <w:proofErr w:type="gramStart"/>
-      <w:r>
-        <w:t>With</w:t>
-      </w:r>
-      <w:proofErr w:type="gramEnd"/>
-      <w:r>
-        <w:t xml:space="preserve"> Brand-Specific Notes</w:t>
+        <w:t>Core Workflow With Brand-Specific Notes</w:t>
       </w:r>
     </w:p>
     <w:p>
@@ -2038,15 +2007,7 @@
         <w:spacing w:before="40" w:after="80"/>
       </w:pPr>
       <w:r>
-        <w:t xml:space="preserve">The </w:t>
-      </w:r>
-      <w:proofErr w:type="spellStart"/>
-      <w:r>
-        <w:t>ProGrade</w:t>
-      </w:r>
-      <w:proofErr w:type="spellEnd"/>
-      <w:r>
-        <w:t xml:space="preserve"> Load Building Tool follows a consistent five-step workflow across all brand paths. Brand-specific notes are called out within each step.</w:t>
+        <w:t>The ProGrade Load Building Tool follows a consistent five-step workflow across all brand paths. Brand-specific notes are called out within each step.</w:t>
       </w:r>
     </w:p>
     <w:p>
@@ -2107,12 +2068,6 @@
         <w:gridCol w:w="1696"/>
       </w:tblGrid>
       <w:tr>
-        <w:tblPrEx>
-          <w:tblCellMar>
-            <w:top w:w="0" w:type="dxa"/>
-            <w:bottom w:w="0" w:type="dxa"/>
-          </w:tblCellMar>
-        </w:tblPrEx>
         <w:tc>
           <w:tcPr>
             <w:tcW w:w="1696" w:type="dxa"/>
@@ -2573,7 +2528,6 @@
         <w:spacing w:before="40" w:after="80"/>
       </w:pPr>
       <w:r>
-        <w:lastRenderedPageBreak/>
         <w:t>From the sessions page, users can also review a summary of prior loads or directly export a PDF of any previous session.</w:t>
       </w:r>
     </w:p>
@@ -2779,23 +2733,7 @@
           <w:i/>
           <w:sz w:val="19"/>
         </w:rPr>
-        <w:t xml:space="preserve">. </w:t>
-      </w:r>
-      <w:proofErr w:type="spellStart"/>
-      <w:r>
-        <w:rPr>
-          <w:i/>
-          <w:sz w:val="19"/>
-        </w:rPr>
-        <w:t>ProGrade</w:t>
-      </w:r>
-      <w:proofErr w:type="spellEnd"/>
-      <w:r>
-        <w:rPr>
-          <w:i/>
-          <w:sz w:val="19"/>
-        </w:rPr>
-        <w:t xml:space="preserve"> sessions workspace used to start or resume the </w:t>
+        <w:t xml:space="preserve">. ProGrade sessions workspace used to start or resume the </w:t>
       </w:r>
       <w:r>
         <w:rPr>
@@ -2870,12 +2808,6 @@
         <w:gridCol w:w="2220"/>
       </w:tblGrid>
       <w:tr>
-        <w:tblPrEx>
-          <w:tblCellMar>
-            <w:top w:w="0" w:type="dxa"/>
-            <w:bottom w:w="0" w:type="dxa"/>
-          </w:tblCellMar>
-        </w:tblPrEx>
         <w:tc>
           <w:tcPr>
             <w:tcW w:w="2220" w:type="dxa"/>
@@ -3244,7 +3176,6 @@
         </w:numPr>
       </w:pPr>
       <w:r>
-        <w:lastRenderedPageBreak/>
         <w:t>Add units from the SKU list by navigating: Category → Model → Item.</w:t>
       </w:r>
     </w:p>
@@ -3257,15 +3188,7 @@
         </w:numPr>
       </w:pPr>
       <w:r>
-        <w:t xml:space="preserve">Drag and drop units into desired stack positions. Options include starting new stacks on each deck or </w:t>
-      </w:r>
-      <w:proofErr w:type="gramStart"/>
-      <w:r>
-        <w:t>adding</w:t>
-      </w:r>
-      <w:proofErr w:type="gramEnd"/>
-      <w:r>
-        <w:t xml:space="preserve"> to existing stacks.</w:t>
+        <w:t>Drag and drop units into desired stack positions. Options include starting new stacks on each deck or adding to existing stacks.</w:t>
       </w:r>
     </w:p>
     <w:p>
@@ -3480,12 +3403,6 @@
         <w:gridCol w:w="10080"/>
       </w:tblGrid>
       <w:tr>
-        <w:tblPrEx>
-          <w:tblCellMar>
-            <w:top w:w="0" w:type="dxa"/>
-            <w:bottom w:w="0" w:type="dxa"/>
-          </w:tblCellMar>
-        </w:tblPrEx>
         <w:tc>
           <w:tcPr>
             <w:tcW w:w="10080" w:type="dxa"/>
@@ -3572,12 +3489,6 @@
         <w:gridCol w:w="10080"/>
       </w:tblGrid>
       <w:tr>
-        <w:tblPrEx>
-          <w:tblCellMar>
-            <w:top w:w="0" w:type="dxa"/>
-            <w:bottom w:w="0" w:type="dxa"/>
-          </w:tblCellMar>
-        </w:tblPrEx>
         <w:tc>
           <w:tcPr>
             <w:tcW w:w="10080" w:type="dxa"/>
@@ -3654,12 +3565,6 @@
         <w:gridCol w:w="2220"/>
       </w:tblGrid>
       <w:tr>
-        <w:tblPrEx>
-          <w:tblCellMar>
-            <w:top w:w="0" w:type="dxa"/>
-            <w:bottom w:w="0" w:type="dxa"/>
-          </w:tblCellMar>
-        </w:tblPrEx>
         <w:tc>
           <w:tcPr>
             <w:tcW w:w="2220" w:type="dxa"/>
@@ -4040,15 +3945,7 @@
         </w:numPr>
       </w:pPr>
       <w:r>
-        <w:t xml:space="preserve">Apply the warehouse filter to scope suggestions </w:t>
-      </w:r>
-      <w:proofErr w:type="gramStart"/>
-      <w:r>
-        <w:t>to</w:t>
-      </w:r>
-      <w:proofErr w:type="gramEnd"/>
-      <w:r>
-        <w:t xml:space="preserve"> available on-hand inventory.</w:t>
+        <w:t>Apply the warehouse filter to scope suggestions to available on-hand inventory.</w:t>
       </w:r>
     </w:p>
     <w:p>
@@ -4072,6 +3969,7 @@
         </w:numPr>
       </w:pPr>
       <w:r>
+        <w:lastRenderedPageBreak/>
         <w:t>Add units that satisfy stack constraints and current inventory availability.</w:t>
       </w:r>
     </w:p>
@@ -4107,7 +4005,6 @@
         <w:rPr>
           <w:noProof/>
         </w:rPr>
-        <w:lastRenderedPageBreak/>
         <w:drawing>
           <wp:inline distT="0" distB="0" distL="0" distR="0" wp14:anchorId="4D196ACD" wp14:editId="632314D6">
             <wp:extent cx="4752153" cy="1739680"/>
@@ -4201,15 +4098,7 @@
         <w:spacing w:before="40" w:after="80"/>
       </w:pPr>
       <w:r>
-        <w:t xml:space="preserve">Settings are the operational knowledge base that powers the </w:t>
-      </w:r>
-      <w:proofErr w:type="spellStart"/>
-      <w:r>
-        <w:t>ProGrade</w:t>
-      </w:r>
-      <w:proofErr w:type="spellEnd"/>
-      <w:r>
-        <w:t xml:space="preserve"> Load Building Tool. They encode brand-specific stacking behavior and space-consumption assumptions. Keeping them accurate is essential — incorrect dimensions cascade directly into incorrect fit recommendations across every load that references that SKU.</w:t>
+        <w:t>Settings are the operational knowledge base that powers the ProGrade Load Building Tool. They encode brand-specific stacking behavior and space-consumption assumptions. Keeping them accurate is essential — incorrect dimensions cascade directly into incorrect fit recommendations across every load that references that SKU.</w:t>
       </w:r>
     </w:p>
     <w:p>
@@ -4273,15 +4162,7 @@
         </w:numPr>
       </w:pPr>
       <w:r>
-        <w:t xml:space="preserve">Trailer profiles (e.g., 53_step_deck, 53_flatbed, </w:t>
-      </w:r>
-      <w:proofErr w:type="spellStart"/>
-      <w:r>
-        <w:t>ground_pull</w:t>
-      </w:r>
-      <w:proofErr w:type="spellEnd"/>
-      <w:r>
-        <w:t>)</w:t>
+        <w:t>Trailer profiles (e.g., 53_step_deck, 53_flatbed, ground_pull)</w:t>
       </w:r>
     </w:p>
     <w:p>
@@ -4346,12 +4227,6 @@
         <w:gridCol w:w="1696"/>
       </w:tblGrid>
       <w:tr>
-        <w:tblPrEx>
-          <w:tblCellMar>
-            <w:top w:w="0" w:type="dxa"/>
-            <w:bottom w:w="0" w:type="dxa"/>
-          </w:tblCellMar>
-        </w:tblPrEx>
         <w:tc>
           <w:tcPr>
             <w:tcW w:w="1696" w:type="dxa"/>
@@ -4569,7 +4444,6 @@
               <w:spacing w:after="16"/>
               <w:jc w:val="center"/>
             </w:pPr>
-            <w:proofErr w:type="gramStart"/>
             <w:r>
               <w:rPr>
                 <w:b/>
@@ -4578,9 +4452,94 @@
                 <w:sz w:val="17"/>
                 <w:szCs w:val="17"/>
               </w:rPr>
-              <w:t>Search</w:t>
-            </w:r>
-            <w:proofErr w:type="gramEnd"/>
+              <w:t>Search SKU First</w:t>
+            </w:r>
+          </w:p>
+          <w:p>
+            <w:pPr>
+              <w:jc w:val="center"/>
+            </w:pPr>
+            <w:r>
+              <w:rPr>
+                <w:color w:val="B8D4F0"/>
+                <w:sz w:val="15"/>
+                <w:szCs w:val="15"/>
+              </w:rPr>
+              <w:t>Avoid duplicates</w:t>
+            </w:r>
+          </w:p>
+        </w:tc>
+        <w:tc>
+          <w:tcPr>
+            <w:tcW w:w="400" w:type="dxa"/>
+            <w:tcBorders>
+              <w:top w:val="none" w:sz="0" w:space="0" w:color="FFFFFF"/>
+              <w:left w:val="none" w:sz="0" w:space="0" w:color="FFFFFF"/>
+              <w:bottom w:val="none" w:sz="0" w:space="0" w:color="FFFFFF"/>
+              <w:right w:val="none" w:sz="0" w:space="0" w:color="FFFFFF"/>
+            </w:tcBorders>
+            <w:shd w:val="clear" w:color="auto" w:fill="FFFFFF"/>
+            <w:tcMar>
+              <w:top w:w="0" w:type="dxa"/>
+              <w:left w:w="0" w:type="dxa"/>
+              <w:bottom w:w="0" w:type="dxa"/>
+              <w:right w:w="0" w:type="dxa"/>
+            </w:tcMar>
+            <w:vAlign w:val="center"/>
+          </w:tcPr>
+          <w:p>
+            <w:pPr>
+              <w:jc w:val="center"/>
+            </w:pPr>
+            <w:r>
+              <w:rPr>
+                <w:color w:val="2E74B5"/>
+                <w:sz w:val="22"/>
+                <w:szCs w:val="22"/>
+              </w:rPr>
+              <w:t>▶</w:t>
+            </w:r>
+          </w:p>
+        </w:tc>
+        <w:tc>
+          <w:tcPr>
+            <w:tcW w:w="1696" w:type="dxa"/>
+            <w:tcBorders>
+              <w:top w:val="none" w:sz="0" w:space="0" w:color="FFFFFF"/>
+              <w:left w:val="none" w:sz="0" w:space="0" w:color="FFFFFF"/>
+              <w:bottom w:val="none" w:sz="0" w:space="0" w:color="FFFFFF"/>
+              <w:right w:val="none" w:sz="0" w:space="0" w:color="FFFFFF"/>
+            </w:tcBorders>
+            <w:shd w:val="clear" w:color="auto" w:fill="1F3864"/>
+            <w:tcMar>
+              <w:top w:w="120" w:type="dxa"/>
+              <w:left w:w="100" w:type="dxa"/>
+              <w:bottom w:w="120" w:type="dxa"/>
+              <w:right w:w="100" w:type="dxa"/>
+            </w:tcMar>
+            <w:vAlign w:val="center"/>
+          </w:tcPr>
+          <w:p>
+            <w:pPr>
+              <w:spacing w:after="20"/>
+              <w:jc w:val="center"/>
+            </w:pPr>
+            <w:r>
+              <w:rPr>
+                <w:b/>
+                <w:bCs/>
+                <w:color w:val="FFFFFF"/>
+                <w:sz w:val="26"/>
+                <w:szCs w:val="26"/>
+              </w:rPr>
+              <w:t>4</w:t>
+            </w:r>
+          </w:p>
+          <w:p>
+            <w:pPr>
+              <w:spacing w:after="16"/>
+              <w:jc w:val="center"/>
+            </w:pPr>
             <w:r>
               <w:rPr>
                 <w:b/>
@@ -4589,7 +4548,7 @@
                 <w:sz w:val="17"/>
                 <w:szCs w:val="17"/>
               </w:rPr>
-              <w:t xml:space="preserve"> SKU First</w:t>
+              <w:t>Add or Edit Fields</w:t>
             </w:r>
           </w:p>
           <w:p>
@@ -4602,7 +4561,7 @@
                 <w:sz w:val="15"/>
                 <w:szCs w:val="15"/>
               </w:rPr>
-              <w:t>Avoid duplicates</w:t>
+              <w:t>Dimensions &amp; stacking</w:t>
             </w:r>
           </w:p>
         </w:tc>
@@ -4669,7 +4628,7 @@
                 <w:sz w:val="26"/>
                 <w:szCs w:val="26"/>
               </w:rPr>
-              <w:t>4</w:t>
+              <w:t>5</w:t>
             </w:r>
           </w:p>
           <w:p>
@@ -4685,102 +4644,6 @@
                 <w:sz w:val="17"/>
                 <w:szCs w:val="17"/>
               </w:rPr>
-              <w:t>Add or Edit Fields</w:t>
-            </w:r>
-          </w:p>
-          <w:p>
-            <w:pPr>
-              <w:jc w:val="center"/>
-            </w:pPr>
-            <w:r>
-              <w:rPr>
-                <w:color w:val="B8D4F0"/>
-                <w:sz w:val="15"/>
-                <w:szCs w:val="15"/>
-              </w:rPr>
-              <w:t>Dimensions &amp; stacking</w:t>
-            </w:r>
-          </w:p>
-        </w:tc>
-        <w:tc>
-          <w:tcPr>
-            <w:tcW w:w="400" w:type="dxa"/>
-            <w:tcBorders>
-              <w:top w:val="none" w:sz="0" w:space="0" w:color="FFFFFF"/>
-              <w:left w:val="none" w:sz="0" w:space="0" w:color="FFFFFF"/>
-              <w:bottom w:val="none" w:sz="0" w:space="0" w:color="FFFFFF"/>
-              <w:right w:val="none" w:sz="0" w:space="0" w:color="FFFFFF"/>
-            </w:tcBorders>
-            <w:shd w:val="clear" w:color="auto" w:fill="FFFFFF"/>
-            <w:tcMar>
-              <w:top w:w="0" w:type="dxa"/>
-              <w:left w:w="0" w:type="dxa"/>
-              <w:bottom w:w="0" w:type="dxa"/>
-              <w:right w:w="0" w:type="dxa"/>
-            </w:tcMar>
-            <w:vAlign w:val="center"/>
-          </w:tcPr>
-          <w:p>
-            <w:pPr>
-              <w:jc w:val="center"/>
-            </w:pPr>
-            <w:r>
-              <w:rPr>
-                <w:color w:val="2E74B5"/>
-                <w:sz w:val="22"/>
-                <w:szCs w:val="22"/>
-              </w:rPr>
-              <w:t>▶</w:t>
-            </w:r>
-          </w:p>
-        </w:tc>
-        <w:tc>
-          <w:tcPr>
-            <w:tcW w:w="1696" w:type="dxa"/>
-            <w:tcBorders>
-              <w:top w:val="none" w:sz="0" w:space="0" w:color="FFFFFF"/>
-              <w:left w:val="none" w:sz="0" w:space="0" w:color="FFFFFF"/>
-              <w:bottom w:val="none" w:sz="0" w:space="0" w:color="FFFFFF"/>
-              <w:right w:val="none" w:sz="0" w:space="0" w:color="FFFFFF"/>
-            </w:tcBorders>
-            <w:shd w:val="clear" w:color="auto" w:fill="1F3864"/>
-            <w:tcMar>
-              <w:top w:w="120" w:type="dxa"/>
-              <w:left w:w="100" w:type="dxa"/>
-              <w:bottom w:w="120" w:type="dxa"/>
-              <w:right w:w="100" w:type="dxa"/>
-            </w:tcMar>
-            <w:vAlign w:val="center"/>
-          </w:tcPr>
-          <w:p>
-            <w:pPr>
-              <w:spacing w:after="20"/>
-              <w:jc w:val="center"/>
-            </w:pPr>
-            <w:r>
-              <w:rPr>
-                <w:b/>
-                <w:bCs/>
-                <w:color w:val="FFFFFF"/>
-                <w:sz w:val="26"/>
-                <w:szCs w:val="26"/>
-              </w:rPr>
-              <w:t>5</w:t>
-            </w:r>
-          </w:p>
-          <w:p>
-            <w:pPr>
-              <w:spacing w:after="16"/>
-              <w:jc w:val="center"/>
-            </w:pPr>
-            <w:r>
-              <w:rPr>
-                <w:b/>
-                <w:bCs/>
-                <w:color w:val="FFFFFF"/>
-                <w:sz w:val="17"/>
-                <w:szCs w:val="17"/>
-              </w:rPr>
               <w:t>Save &amp; Re-Validate</w:t>
             </w:r>
           </w:p>
@@ -4814,15 +4677,7 @@
         </w:numPr>
       </w:pPr>
       <w:r>
-        <w:t xml:space="preserve">Open Settings within the </w:t>
-      </w:r>
-      <w:proofErr w:type="spellStart"/>
-      <w:r>
-        <w:t>ProGrade</w:t>
-      </w:r>
-      <w:proofErr w:type="spellEnd"/>
-      <w:r>
-        <w:t xml:space="preserve"> Load Building Tool.</w:t>
+        <w:t>Open Settings within the ProGrade Load Building Tool.</w:t>
       </w:r>
     </w:p>
     <w:p>
@@ -4987,12 +4842,6 @@
         <w:gridCol w:w="10080"/>
       </w:tblGrid>
       <w:tr>
-        <w:tblPrEx>
-          <w:tblCellMar>
-            <w:top w:w="0" w:type="dxa"/>
-            <w:bottom w:w="0" w:type="dxa"/>
-          </w:tblCellMar>
-        </w:tblPrEx>
         <w:tc>
           <w:tcPr>
             <w:tcW w:w="10080" w:type="dxa"/>
@@ -5058,10 +4907,7 @@
         <w:spacing w:before="40" w:after="80"/>
       </w:pPr>
       <w:r>
-        <w:t>The Inventory Gap Finder is not a separate rule system — it depends on three inputs</w:t>
-      </w:r>
-      <w:r>
-        <w:t>:</w:t>
+        <w:t>The Inventory Gap Finder is not a separate rule system — it depends on three inputs:</w:t>
       </w:r>
     </w:p>
     <w:p>
@@ -5179,12 +5025,6 @@
         <w:gridCol w:w="2790"/>
       </w:tblGrid>
       <w:tr>
-        <w:tblPrEx>
-          <w:tblCellMar>
-            <w:top w:w="0" w:type="dxa"/>
-            <w:bottom w:w="0" w:type="dxa"/>
-          </w:tblCellMar>
-        </w:tblPrEx>
         <w:trPr>
           <w:tblHeader/>
         </w:trPr>
@@ -5280,12 +5120,6 @@
         </w:tc>
       </w:tr>
       <w:tr>
-        <w:tblPrEx>
-          <w:tblCellMar>
-            <w:top w:w="0" w:type="dxa"/>
-            <w:bottom w:w="0" w:type="dxa"/>
-          </w:tblCellMar>
-        </w:tblPrEx>
         <w:tc>
           <w:tcPr>
             <w:tcW w:w="2800" w:type="dxa"/>
@@ -5437,12 +5271,6 @@
         </w:tc>
       </w:tr>
       <w:tr>
-        <w:tblPrEx>
-          <w:tblCellMar>
-            <w:top w:w="0" w:type="dxa"/>
-            <w:bottom w:w="0" w:type="dxa"/>
-          </w:tblCellMar>
-        </w:tblPrEx>
         <w:tc>
           <w:tcPr>
             <w:tcW w:w="2800" w:type="dxa"/>
@@ -5526,12 +5354,6 @@
         </w:tc>
       </w:tr>
       <w:tr>
-        <w:tblPrEx>
-          <w:tblCellMar>
-            <w:top w:w="0" w:type="dxa"/>
-            <w:bottom w:w="0" w:type="dxa"/>
-          </w:tblCellMar>
-        </w:tblPrEx>
         <w:tc>
           <w:tcPr>
             <w:tcW w:w="2800" w:type="dxa"/>
@@ -5662,12 +5484,6 @@
         <w:gridCol w:w="5040"/>
       </w:tblGrid>
       <w:tr>
-        <w:tblPrEx>
-          <w:tblCellMar>
-            <w:top w:w="0" w:type="dxa"/>
-            <w:bottom w:w="0" w:type="dxa"/>
-          </w:tblCellMar>
-        </w:tblPrEx>
         <w:trPr>
           <w:tblHeader/>
         </w:trPr>
@@ -5733,12 +5549,6 @@
         </w:tc>
       </w:tr>
       <w:tr>
-        <w:tblPrEx>
-          <w:tblCellMar>
-            <w:top w:w="0" w:type="dxa"/>
-            <w:bottom w:w="0" w:type="dxa"/>
-          </w:tblCellMar>
-        </w:tblPrEx>
         <w:tc>
           <w:tcPr>
             <w:tcW w:w="5040" w:type="dxa"/>
@@ -5795,12 +5605,6 @@
         </w:tc>
       </w:tr>
       <w:tr>
-        <w:tblPrEx>
-          <w:tblCellMar>
-            <w:top w:w="0" w:type="dxa"/>
-            <w:bottom w:w="0" w:type="dxa"/>
-          </w:tblCellMar>
-        </w:tblPrEx>
         <w:tc>
           <w:tcPr>
             <w:tcW w:w="5040" w:type="dxa"/>
@@ -5857,12 +5661,6 @@
         </w:tc>
       </w:tr>
       <w:tr>
-        <w:tblPrEx>
-          <w:tblCellMar>
-            <w:top w:w="0" w:type="dxa"/>
-            <w:bottom w:w="0" w:type="dxa"/>
-          </w:tblCellMar>
-        </w:tblPrEx>
         <w:trPr>
           <w:trHeight w:val="386"/>
         </w:trPr>
@@ -5977,23 +5775,13 @@
       </w:tabs>
       <w:spacing w:before="120"/>
     </w:pPr>
-    <w:proofErr w:type="gramStart"/>
     <w:r>
       <w:rPr>
         <w:color w:val="888888"/>
         <w:sz w:val="16"/>
         <w:szCs w:val="16"/>
       </w:rPr>
-      <w:t>CONFIDENTIAL  |</w:t>
-    </w:r>
-    <w:proofErr w:type="gramEnd"/>
-    <w:r>
-      <w:rPr>
-        <w:color w:val="888888"/>
-        <w:sz w:val="16"/>
-        <w:szCs w:val="16"/>
-      </w:rPr>
-      <w:t xml:space="preserve">  For Internal Use</w:t>
+      <w:t>CONFIDENTIAL  |  For Internal Use</w:t>
     </w:r>
     <w:r>
       <w:rPr>
@@ -6214,7 +6002,6 @@
         </wp:anchor>
       </w:drawing>
     </w:r>
-    <w:proofErr w:type="spellStart"/>
     <w:r>
       <w:rPr>
         <w:b/>
@@ -6223,18 +6010,7 @@
         <w:sz w:val="18"/>
         <w:szCs w:val="18"/>
       </w:rPr>
-      <w:t>ProGrade</w:t>
-    </w:r>
-    <w:proofErr w:type="spellEnd"/>
-    <w:r>
-      <w:rPr>
-        <w:b/>
-        <w:bCs/>
-        <w:color w:val="1F3864"/>
-        <w:sz w:val="18"/>
-        <w:szCs w:val="18"/>
-      </w:rPr>
-      <w:t xml:space="preserve"> Load Building Tool</w:t>
+      <w:t>ProGrade Load Building Tool</w:t>
     </w:r>
     <w:r>
       <w:rPr>

</xml_diff>